<commit_message>
Worked on multiple merge functions. Added new date formatting function.
</commit_message>
<xml_diff>
--- a/project/documents/letters/NatlPhase.docx
+++ b/project/documents/letters/NatlPhase.docx
@@ -4,167 +4,70 @@
   <w:body>
     <w:p>
       <w:pPr>
-        <w:tabs>
-          <w:tab w:val="right" w:pos="9360"/>
-        </w:tabs>
-      </w:pPr>
-      <w:r>
-        <w:rPr>
-          <w:b/>
-          <w:bCs/>
-        </w:rPr>
-        <w:t>&lt;&lt;WAName&gt;&gt; &lt;&lt;WAPhone&gt;&gt; - Direct Dial</w:t>
-      </w:r>
-      <w:r>
-        <w:rPr>
-          <w:b/>
-          <w:bCs/>
-        </w:rPr>
-        <w:tab/>
-        <w:t>&lt;&lt;paraName&gt;&gt; &lt;&lt;paraPhone&gt;&gt; - Direct Dial</w:t>
-      </w:r>
-    </w:p>
-    <w:p>
-      <w:pPr>
-        <w:tabs>
-          <w:tab w:val="right" w:pos="9360"/>
-        </w:tabs>
-      </w:pPr>
-      <w:r>
-        <w:rPr>
-          <w:b/>
-          <w:bCs/>
-        </w:rPr>
-        <w:t>&lt;&lt;WAEmail&gt;&gt;</w:t>
-      </w:r>
-      <w:r>
-        <w:rPr>
-          <w:b/>
-          <w:bCs/>
-        </w:rPr>
-        <w:tab/>
-        <w:t>&lt;&lt;paraEmail&gt;&gt;</w:t>
-      </w:r>
-    </w:p>
-    <w:p>
-      <w:pPr>
-        <w:rPr>
-          <w:b/>
-          <w:bCs/>
-        </w:rPr>
-      </w:pPr>
-    </w:p>
-    <w:p>
-      <w:pPr>
-        <w:rPr>
-          <w:sz w:val="24"/>
-          <w:szCs w:val="24"/>
-        </w:rPr>
-      </w:pPr>
-      <w:r>
-        <w:rPr>
-          <w:sz w:val="24"/>
-          <w:szCs w:val="24"/>
-        </w:rPr>
-        <w:t>&lt;&lt;currentDate&gt;&gt;</w:t>
-      </w:r>
-    </w:p>
-    <w:p>
-      <w:pPr>
-        <w:rPr>
-          <w:sz w:val="24"/>
-          <w:szCs w:val="24"/>
-        </w:rPr>
-      </w:pPr>
-    </w:p>
-    <w:p>
-      <w:pPr>
-        <w:tabs>
-          <w:tab w:val="left" w:pos="-1440"/>
-        </w:tabs>
-        <w:rPr>
-          <w:sz w:val="24"/>
-          <w:szCs w:val="24"/>
-        </w:rPr>
-      </w:pPr>
-      <w:r>
-        <w:rPr>
-          <w:sz w:val="24"/>
-          <w:szCs w:val="24"/>
-        </w:rPr>
-        <w:t>&lt;&lt;recipient&gt;&gt;</w:t>
-      </w:r>
-    </w:p>
-    <w:p>
-      <w:pPr>
-        <w:tabs>
-          <w:tab w:val="left" w:pos="-1440"/>
-        </w:tabs>
-        <w:rPr>
-          <w:sz w:val="24"/>
-          <w:szCs w:val="24"/>
-        </w:rPr>
-      </w:pPr>
-      <w:r>
-        <w:rPr>
-          <w:sz w:val="24"/>
-          <w:szCs w:val="24"/>
-        </w:rPr>
-        <w:t>&lt;&lt;corrContactTitle&gt;&gt;</w:t>
-      </w:r>
-    </w:p>
-    <w:p>
-      <w:pPr>
-        <w:tabs>
-          <w:tab w:val="left" w:pos="-1440"/>
-        </w:tabs>
-        <w:rPr>
-          <w:sz w:val="24"/>
-          <w:szCs w:val="24"/>
-        </w:rPr>
-      </w:pPr>
-      <w:r>
-        <w:rPr>
-          <w:sz w:val="24"/>
-          <w:szCs w:val="24"/>
-        </w:rPr>
-        <w:t>&lt;&lt;orgName&gt;&gt;</w:t>
-      </w:r>
-    </w:p>
-    <w:p>
-      <w:pPr>
-        <w:tabs>
-          <w:tab w:val="right" w:pos="9360"/>
-        </w:tabs>
-        <w:rPr>
-          <w:sz w:val="24"/>
-          <w:szCs w:val="24"/>
-        </w:rPr>
-      </w:pPr>
-      <w:r>
-        <w:rPr>
-          <w:sz w:val="24"/>
-          <w:szCs w:val="24"/>
-        </w:rPr>
-        <w:t>&lt;&lt;workAddr&gt;&gt;</w:t>
-      </w:r>
-    </w:p>
-    <w:p>
-      <w:pPr>
-        <w:tabs>
-          <w:tab w:val="right" w:pos="9360"/>
-        </w:tabs>
-        <w:rPr>
-          <w:sz w:val="24"/>
-          <w:szCs w:val="24"/>
-        </w:rPr>
-      </w:pPr>
-      <w:r>
-        <w:rPr>
-          <w:sz w:val="24"/>
-          <w:szCs w:val="24"/>
-        </w:rPr>
-        <w:t>&lt;&lt;CSZ&gt;&gt;</w:t>
+        <w:pStyle w:val="NormalWeb"/>
+        <w:spacing w:before="0" w:beforeAutospacing="0" w:after="0" w:afterAutospacing="0"/>
+      </w:pPr>
+      <w:r>
+        <w:t xml:space="preserve">Subject line: &lt;&lt;orgName&gt;&gt;: &lt;&lt;clientRefNo&gt;&gt; / SLW Ref: &lt;&lt;matterNo&gt;&gt; / </w:t>
+      </w:r>
+      <w:r>
+        <w:t>Instructions Needed - National Stage Filings</w:t>
+      </w:r>
+    </w:p>
+    <w:p>
+      <w:pPr>
+        <w:pStyle w:val="NormalWeb"/>
+        <w:spacing w:before="0" w:beforeAutospacing="0" w:after="0" w:afterAutospacing="0"/>
+      </w:pPr>
+    </w:p>
+    <w:p>
+      <w:pPr>
+        <w:pStyle w:val="NormalWeb"/>
+        <w:spacing w:before="0" w:beforeAutospacing="0" w:after="0" w:afterAutospacing="0"/>
+      </w:pPr>
+    </w:p>
+    <w:p>
+      <w:pPr>
+        <w:pStyle w:val="NormalWeb"/>
+        <w:spacing w:before="0" w:beforeAutospacing="0" w:after="0" w:afterAutospacing="0"/>
+      </w:pPr>
+    </w:p>
+    <w:p>
+      <w:pPr>
+        <w:pStyle w:val="NormalWeb"/>
+        <w:spacing w:before="0" w:beforeAutospacing="0" w:after="0" w:afterAutospacing="0"/>
+      </w:pPr>
+      <w:r>
+        <w:t>Body:</w:t>
+      </w:r>
+    </w:p>
+    <w:p>
+      <w:pPr>
+        <w:pStyle w:val="NormalWeb"/>
+        <w:spacing w:before="0" w:beforeAutospacing="0" w:after="0" w:afterAutospacing="0"/>
+      </w:pPr>
+    </w:p>
+    <w:p>
+      <w:pPr>
+        <w:pStyle w:val="NormalWeb"/>
+      </w:pPr>
+      <w:r>
+        <w:t xml:space="preserve">SCHWEGMAN LUNDBERG &amp; WOESSNER, P.A. </w:t>
+      </w:r>
+    </w:p>
+    <w:p>
+      <w:pPr>
+        <w:pStyle w:val="NormalWeb"/>
+      </w:pPr>
+    </w:p>
+    <w:p>
+      <w:r>
+        <w:t>&lt;&lt;This.WAName&gt;&gt; &lt;&lt;This.WAPhone&gt;&gt;  &lt;&lt;This.WAEmail&gt;&gt;</w:t>
+      </w:r>
+    </w:p>
+    <w:p>
+      <w:r>
+        <w:t>&lt;&lt;This.paraName&gt;&gt; &lt;&lt;This.paraPhone&gt;&gt;  &lt;&lt;This.paraEmail&gt;&gt;</w:t>
       </w:r>
     </w:p>
     <w:p>
@@ -259,6 +162,7 @@
       <w:pPr>
         <w:ind w:left="720"/>
         <w:rPr>
+          <w:noProof/>
           <w:sz w:val="24"/>
           <w:szCs w:val="24"/>
         </w:rPr>
@@ -281,35 +185,64 @@
     </w:p>
     <w:p>
       <w:pPr>
-        <w:rPr>
-          <w:sz w:val="24"/>
-          <w:szCs w:val="24"/>
-        </w:rPr>
-      </w:pPr>
-    </w:p>
-    <w:p>
-      <w:pPr>
-        <w:rPr>
-          <w:sz w:val="24"/>
-          <w:szCs w:val="24"/>
-        </w:rPr>
-      </w:pPr>
-      <w:r>
+        <w:ind w:left="720"/>
         <w:rPr>
           <w:noProof/>
+          <w:sz w:val="24"/>
+          <w:szCs w:val="24"/>
+        </w:rPr>
+      </w:pPr>
+      <w:r>
+        <w:rPr>
+          <w:noProof/>
+          <w:sz w:val="24"/>
+          <w:szCs w:val="24"/>
+        </w:rPr>
+        <w:t>Inventor(s): &lt;&lt;inventorList&gt;&gt;</w:t>
+      </w:r>
+    </w:p>
+    <w:p>
+      <w:pPr>
+        <w:ind w:left="720"/>
+        <w:rPr>
+          <w:sz w:val="24"/>
+          <w:szCs w:val="24"/>
+        </w:rPr>
+      </w:pPr>
+      <w:r>
+        <w:rPr>
+          <w:noProof/>
+          <w:sz w:val="24"/>
+          <w:szCs w:val="24"/>
+        </w:rPr>
+        <w:t xml:space="preserve">Earliest Priority Information: Serial No. </w:t>
+      </w:r>
+    </w:p>
+    <w:p>
+      <w:pPr>
+        <w:rPr>
+          <w:sz w:val="24"/>
+          <w:szCs w:val="24"/>
+          <w:u w:val="thick"/>
+        </w:rPr>
+      </w:pPr>
+      <w:r>
+        <w:t>__________________________________________________________________________________________</w:t>
+      </w:r>
+    </w:p>
+    <w:p>
+      <w:pPr>
+        <w:rPr>
+          <w:sz w:val="24"/>
+          <w:szCs w:val="24"/>
+        </w:rPr>
+      </w:pPr>
+      <w:r>
+        <w:rPr>
+          <w:noProof/>
         </w:rPr>
         <w:pict w14:anchorId="04BE1527">
-          <v:line id="_x0000_s1026" style="position:absolute;z-index:251656192;mso-position-horizontal-relative:margin" from="0,0" to="0,0" o:allowincell="f" strokecolor="#020000" strokeweight=".96pt">
-            <w10:wrap anchorx="margin"/>
-          </v:line>
-        </w:pict>
-      </w:r>
-      <w:r>
-        <w:rPr>
-          <w:noProof/>
-        </w:rPr>
-        <w:pict w14:anchorId="0B3E3244">
-          <v:line id="_x0000_s1027" style="position:absolute;z-index:251657216;mso-position-horizontal-relative:margin" from="0,.45pt" to="468pt,.45pt" o:allowincell="f" strokecolor="#020000" strokeweight=".96pt">
+          <v:line id="_x0000_s1026" style="position:absolute;z-index:1;mso-position-horizontal-relative:margin" from="0,0" to="0,0" o:allowincell="f" strokecolor="#020000" strokeweight=".96pt">
             <w10:wrap anchorx="margin"/>
           </v:line>
         </w:pict>
@@ -349,7 +282,7 @@
           <w:sz w:val="24"/>
           <w:szCs w:val="24"/>
         </w:rPr>
-        <w:tab/>
+        <w:t xml:space="preserve"> </w:t>
       </w:r>
       <w:r>
         <w:rPr>
@@ -398,7 +331,7 @@
           <w:sz w:val="24"/>
           <w:szCs w:val="24"/>
         </w:rPr>
-        <w:tab/>
+        <w:t xml:space="preserve"> </w:t>
       </w:r>
       <w:r>
         <w:rPr>
@@ -448,6 +381,9 @@
           <w:szCs w:val="28"/>
         </w:rPr>
       </w:pPr>
+      <w:r>
+        <w:t>__________________________________________________________________________________________ </w:t>
+      </w:r>
     </w:p>
     <w:p>
       <w:pPr>
@@ -461,35 +397,40 @@
           <w:noProof/>
         </w:rPr>
         <w:pict w14:anchorId="6C1B1DE9">
-          <v:line id="_x0000_s1030" style="position:absolute;z-index:251658240;mso-position-horizontal-relative:margin" from="0,0" to="0,0" o:allowincell="f" strokecolor="#020000" strokeweight=".96pt">
+          <v:line id="_x0000_s1030" style="position:absolute;z-index:2;mso-position-horizontal-relative:margin" from="0,0" to="0,0" o:allowincell="f" strokecolor="#020000" strokeweight=".96pt">
             <w10:wrap anchorx="margin"/>
           </v:line>
         </w:pict>
       </w:r>
       <w:r>
         <w:rPr>
+          <w:sz w:val="24"/>
+          <w:szCs w:val="24"/>
+        </w:rPr>
+        <w:t xml:space="preserve"> </w:t>
+      </w:r>
+      <w:r>
+        <w:rPr>
           <w:noProof/>
-        </w:rPr>
-        <w:pict w14:anchorId="67577139">
-          <v:line id="_x0000_s1031" style="position:absolute;z-index:251659264;mso-position-horizontal-relative:margin" from="0,.45pt" to="468pt,.45pt" o:allowincell="f" strokecolor="#020000" strokeweight=".96pt">
-            <w10:wrap anchorx="margin"/>
-          </v:line>
-        </w:pict>
-      </w:r>
-    </w:p>
-    <w:p>
-      <w:pPr>
-        <w:rPr>
-          <w:sz w:val="24"/>
-          <w:szCs w:val="24"/>
-        </w:rPr>
-      </w:pPr>
-      <w:r>
-        <w:rPr>
-          <w:sz w:val="24"/>
-          <w:szCs w:val="24"/>
-        </w:rPr>
-        <w:t xml:space="preserve">Dear </w:t>
+          <w:sz w:val="24"/>
+          <w:szCs w:val="24"/>
+        </w:rPr>
+        <w:t>&lt;&lt;salutation&gt;&gt;</w:t>
+      </w:r>
+    </w:p>
+    <w:p>
+      <w:pPr>
+        <w:rPr>
+          <w:sz w:val="24"/>
+          <w:szCs w:val="24"/>
+        </w:rPr>
+      </w:pPr>
+      <w:r>
+        <w:rPr>
+          <w:sz w:val="24"/>
+          <w:szCs w:val="24"/>
+        </w:rPr>
+        <w:t>The PCT application identified above must be converted to regional or national patent applications within 30 months of the priority date of &lt;&lt;priorityDate&gt;&gt;.  Since that time is approaching, your decision regarding the conversion of the international PCT application to national/regional applications in the various designated countries and/or regional offices must soon be made.</w:t>
       </w:r>
       <w:r>
         <w:rPr>
@@ -497,44 +438,6 @@
           <w:sz w:val="24"/>
           <w:szCs w:val="24"/>
         </w:rPr>
-        <w:t>&lt;&lt;salutation&gt;&gt;</w:t>
-      </w:r>
-      <w:r>
-        <w:rPr>
-          <w:sz w:val="24"/>
-          <w:szCs w:val="24"/>
-        </w:rPr>
-        <w:t>:</w:t>
-      </w:r>
-    </w:p>
-    <w:p>
-      <w:pPr>
-        <w:rPr>
-          <w:sz w:val="24"/>
-          <w:szCs w:val="24"/>
-        </w:rPr>
-      </w:pPr>
-    </w:p>
-    <w:p>
-      <w:pPr>
-        <w:rPr>
-          <w:sz w:val="24"/>
-          <w:szCs w:val="24"/>
-        </w:rPr>
-      </w:pPr>
-      <w:r>
-        <w:rPr>
-          <w:sz w:val="24"/>
-          <w:szCs w:val="24"/>
-        </w:rPr>
-        <w:t>The PCT application identified above must be converted to regional or national patent applications within 30 months of the priority date of &lt;&lt;priorityDate&gt;&gt;.  Since that time is approaching, your decision regarding the conversion of the international PCT application to national/regional applications in the various designated countries and/or regional offices must soon be made.</w:t>
-      </w:r>
-      <w:r>
-        <w:rPr>
-          <w:noProof/>
-          <w:sz w:val="24"/>
-          <w:szCs w:val="24"/>
-        </w:rPr>
         <w:t xml:space="preserve">  &lt;&lt;nonProvText1&gt;&gt; </w:t>
       </w:r>
       <w:r>
@@ -620,11 +523,8 @@
         <w:pStyle w:val="BodyText"/>
       </w:pPr>
       <w:r>
-        <w:t xml:space="preserve">Foreign filing is expensive.  The fees to foreign lawyers, foreign patent offices, and translation fees all become payable by us at the time we instruct our foreign associates to prepare national applications.  Accordingly we may need to work out payment arrangements with you before proceeding with the national stage filings.  Satisfactory arrangements need to be in place and any </w:t>
-      </w:r>
-      <w:r>
         <w:lastRenderedPageBreak/>
-        <w:t>required retainers actually received by us before we are able to instruct our overseas associates to prepare the national stage applic</w:t>
+        <w:t>Foreign filing is expensive.  The fees to foreign lawyers, foreign patent offices, and translation fees all become payable by us at the time we instruct our foreign associates to prepare national applications.  Accordingly we may need to work out payment arrangements with you before proceeding with the national stage filings.  Satisfactory arrangements need to be in place and any required retainers actually received by us before we are able to instruct our overseas associates to prepare the national stage applic</w:t>
       </w:r>
       <w:r>
         <w:t>ations.</w:t>
@@ -842,180 +742,25 @@
     </w:p>
     <w:p>
       <w:pPr>
-        <w:rPr>
-          <w:sz w:val="24"/>
-          <w:szCs w:val="24"/>
-        </w:rPr>
-      </w:pPr>
-      <w:r>
-        <w:rPr>
-          <w:sz w:val="24"/>
-          <w:szCs w:val="24"/>
-        </w:rPr>
-        <w:t>Do not hesitate to call us if you would like to discuss this matter further, or if you need cost estimates for filing in specific countries.</w:t>
-      </w:r>
-    </w:p>
-    <w:p>
-      <w:pPr>
-        <w:rPr>
-          <w:sz w:val="24"/>
-          <w:szCs w:val="24"/>
-        </w:rPr>
-      </w:pPr>
-    </w:p>
-    <w:p>
-      <w:pPr>
-        <w:rPr>
-          <w:sz w:val="24"/>
-          <w:szCs w:val="24"/>
-        </w:rPr>
-      </w:pPr>
-      <w:r>
-        <w:rPr>
-          <w:sz w:val="24"/>
-          <w:szCs w:val="24"/>
-        </w:rPr>
-        <w:t>Very truly yours,</w:t>
-      </w:r>
-    </w:p>
-    <w:p>
-      <w:pPr>
-        <w:rPr>
-          <w:sz w:val="24"/>
-          <w:szCs w:val="24"/>
-        </w:rPr>
-      </w:pPr>
-    </w:p>
-    <w:p>
-      <w:pPr>
-        <w:rPr>
-          <w:sz w:val="24"/>
-          <w:szCs w:val="24"/>
-        </w:rPr>
-      </w:pPr>
-    </w:p>
-    <w:p>
-      <w:pPr>
-        <w:pStyle w:val="Header"/>
-        <w:tabs>
-          <w:tab w:val="clear" w:pos="4320"/>
-          <w:tab w:val="clear" w:pos="8640"/>
-        </w:tabs>
-        <w:rPr>
-          <w:sz w:val="24"/>
-          <w:szCs w:val="24"/>
-        </w:rPr>
-      </w:pPr>
-      <w:r>
-        <w:rPr>
-          <w:sz w:val="24"/>
-          <w:szCs w:val="24"/>
-        </w:rPr>
-        <w:t>&lt;&lt;cmgName&gt;&gt;</w:t>
-      </w:r>
-    </w:p>
-    <w:p>
-      <w:pPr>
-        <w:rPr>
-          <w:sz w:val="24"/>
-          <w:szCs w:val="24"/>
-        </w:rPr>
-      </w:pPr>
-      <w:r>
-        <w:rPr>
-          <w:sz w:val="24"/>
-          <w:szCs w:val="24"/>
-        </w:rPr>
-        <w:t>Case Management Assistant</w:t>
-      </w:r>
-    </w:p>
-    <w:p>
-      <w:pPr>
-        <w:rPr>
-          <w:sz w:val="24"/>
-          <w:szCs w:val="24"/>
-        </w:rPr>
-      </w:pPr>
-    </w:p>
-    <w:tbl>
-      <w:tblPr>
-        <w:tblW w:w="9468" w:type="dxa"/>
-        <w:tblLayout w:type="fixed"/>
-        <w:tblLook w:val="01E0" w:firstRow="1" w:lastRow="1" w:firstColumn="1" w:lastColumn="1" w:noHBand="0" w:noVBand="0"/>
-      </w:tblPr>
-      <w:tblGrid>
-        <w:gridCol w:w="648"/>
-        <w:gridCol w:w="8820"/>
-      </w:tblGrid>
-      <w:tr>
-        <w:tc>
-          <w:tcPr>
-            <w:tcW w:w="648" w:type="dxa"/>
-          </w:tcPr>
-          <w:p>
-            <w:pPr>
-              <w:rPr>
-                <w:noProof/>
-                <w:sz w:val="24"/>
-                <w:szCs w:val="24"/>
-              </w:rPr>
-            </w:pPr>
-            <w:r>
-              <w:rPr>
-                <w:noProof/>
-                <w:sz w:val="24"/>
-                <w:szCs w:val="24"/>
-              </w:rPr>
-              <w:t>&lt;&lt;ccTag&gt;&gt;</w:t>
-            </w:r>
-          </w:p>
-        </w:tc>
-        <w:tc>
-          <w:tcPr>
-            <w:tcW w:w="8820" w:type="dxa"/>
-          </w:tcPr>
-          <w:p>
-            <w:pPr>
-              <w:rPr>
-                <w:noProof/>
-                <w:sz w:val="24"/>
-                <w:szCs w:val="24"/>
-              </w:rPr>
-            </w:pPr>
-            <w:r>
-              <w:rPr>
-                <w:noProof/>
-                <w:sz w:val="24"/>
-                <w:szCs w:val="24"/>
-              </w:rPr>
-              <w:t>&lt;&lt;ccName&gt;&gt;</w:t>
-            </w:r>
-          </w:p>
-        </w:tc>
-      </w:tr>
-    </w:tbl>
-    <w:p>
-      <w:pPr>
-        <w:rPr>
-          <w:sz w:val="24"/>
-          <w:szCs w:val="24"/>
-        </w:rPr>
-      </w:pPr>
-    </w:p>
-    <w:p>
-      <w:pPr>
-        <w:rPr>
-          <w:sz w:val="24"/>
-          <w:szCs w:val="24"/>
-        </w:rPr>
-      </w:pPr>
-      <w:r>
-        <w:rPr>
-          <w:sz w:val="24"/>
-          <w:szCs w:val="24"/>
-        </w:rPr>
-        <w:t>Attachments</w:t>
-      </w:r>
+        <w:pStyle w:val="NormalWeb"/>
+      </w:pPr>
+      <w:r>
+        <w:t>Please feel free to call &lt;&lt;This.WAName&gt;&gt; at &lt;&lt;This.WAPhone&gt;&gt;</w:t>
+      </w:r>
+      <w:r>
+        <w:t xml:space="preserve"> </w:t>
+      </w:r>
+      <w:r>
+        <w:t>if you would like to discuss this matter further, or if you need cost estimates for filing in specific countries.</w:t>
+      </w:r>
+    </w:p>
+    <w:p>
+      <w:pPr>
+        <w:rPr>
+          <w:sz w:val="24"/>
+          <w:szCs w:val="24"/>
+        </w:rPr>
+      </w:pPr>
     </w:p>
     <w:sectPr>
       <w:pgSz w:w="12240" w:h="15840"/>
@@ -1464,7 +1209,9 @@
   </w:style>
   <w:style w:type="character" w:default="1" w:styleId="DefaultParagraphFont">
     <w:name w:val="Default Paragraph Font"/>
+    <w:uiPriority w:val="1"/>
     <w:semiHidden/>
+    <w:unhideWhenUsed/>
   </w:style>
   <w:style w:type="table" w:default="1" w:styleId="TableNormal">
     <w:name w:val="Normal Table"/>
@@ -1604,6 +1351,24 @@
     <w:rPr>
       <w:b/>
       <w:bCs/>
+    </w:rPr>
+  </w:style>
+  <w:style w:type="paragraph" w:styleId="NormalWeb">
+    <w:name w:val="Normal (Web)"/>
+    <w:basedOn w:val="Normal"/>
+    <w:uiPriority w:val="99"/>
+    <w:unhideWhenUsed/>
+    <w:rsid w:val="00AA1A93"/>
+    <w:pPr>
+      <w:autoSpaceDE/>
+      <w:autoSpaceDN/>
+      <w:adjustRightInd/>
+      <w:spacing w:before="100" w:beforeAutospacing="1" w:after="100" w:afterAutospacing="1"/>
+    </w:pPr>
+    <w:rPr>
+      <w:rFonts w:ascii="Calibri" w:eastAsia="Calibri" w:hAnsi="Calibri" w:cs="Calibri"/>
+      <w:sz w:val="22"/>
+      <w:szCs w:val="22"/>
     </w:rPr>
   </w:style>
 </w:styles>

</xml_diff>